<commit_message>
fix: polish resume4 and add matching cover4
</commit_message>
<xml_diff>
--- a/anthony.ettinger.cover.docx
+++ b/anthony.ettinger.cover.docx
@@ -4,165 +4,830 @@
   <w:body>
     <w:p>
       <w:pPr>
+        <w:pStyle w:val="Title"/>
+      </w:pPr>
+      <w:r>
+        <w:t xml:space="preserve">Anthony</w:t>
+      </w:r>
+      <w:r>
+        <w:t xml:space="preserve"> </w:t>
+      </w:r>
+      <w:r>
+        <w:t xml:space="preserve">"Chovy"</w:t>
+      </w:r>
+      <w:r>
+        <w:t xml:space="preserve"> </w:t>
+      </w:r>
+      <w:r>
+        <w:t xml:space="preserve">Ettinger</w:t>
+      </w:r>
+    </w:p>
+    <w:bookmarkStart w:id="45" w:name="anthony-chovy-ettinger"/>
+    <w:p>
+      <w:pPr>
+        <w:pStyle w:val="Heading1"/>
+      </w:pPr>
+      <w:r>
+        <w:t xml:space="preserve">Anthony "Chovy" Ettinger</w:t>
+      </w:r>
+    </w:p>
+    <w:bookmarkStart w:id="23" w:name="X46883c467981e70da7d9d14fc80345114a899c1"/>
+    <w:p>
+      <w:pPr>
+        <w:pStyle w:val="Heading2"/>
+      </w:pPr>
+      <w:r>
+        <w:t xml:space="preserve">AI-Augmented Full-Stack Engineer · Founder, Profullstack, Inc.</w:t>
+      </w:r>
+    </w:p>
+    <w:p>
+      <w:pPr>
+        <w:pStyle w:val="Compact"/>
+        <w:numPr>
+          <w:ilvl w:val="0"/>
+          <w:numId w:val="1001"/>
+        </w:numPr>
+      </w:pPr>
+      <w:r>
+        <w:rPr>
+          <w:b/>
+          <w:bCs/>
+        </w:rPr>
+        <w:t xml:space="preserve">Email</w:t>
+      </w:r>
+      <w:r>
+        <w:t xml:space="preserve">:</w:t>
+      </w:r>
+      <w:r>
+        <w:t xml:space="preserve"> </w:t>
+      </w:r>
+      <w:hyperlink r:id="rId20">
+        <w:r>
+          <w:rPr>
+            <w:rStyle w:val="Hyperlink"/>
+          </w:rPr>
+          <w:t xml:space="preserve">ettinger@gmail.com</w:t>
+        </w:r>
+      </w:hyperlink>
+    </w:p>
+    <w:p>
+      <w:pPr>
+        <w:pStyle w:val="Compact"/>
+        <w:numPr>
+          <w:ilvl w:val="0"/>
+          <w:numId w:val="1001"/>
+        </w:numPr>
+      </w:pPr>
+      <w:r>
+        <w:rPr>
+          <w:b/>
+          <w:bCs/>
+        </w:rPr>
+        <w:t xml:space="preserve">Phone</w:t>
+      </w:r>
+      <w:r>
+        <w:t xml:space="preserve">: +1 (408) 656-2473</w:t>
+      </w:r>
+    </w:p>
+    <w:p>
+      <w:pPr>
+        <w:pStyle w:val="Compact"/>
+        <w:numPr>
+          <w:ilvl w:val="0"/>
+          <w:numId w:val="1001"/>
+        </w:numPr>
+      </w:pPr>
+      <w:r>
+        <w:rPr>
+          <w:b/>
+          <w:bCs/>
+        </w:rPr>
+        <w:t xml:space="preserve">Web</w:t>
+      </w:r>
+      <w:r>
+        <w:t xml:space="preserve">:</w:t>
+      </w:r>
+      <w:r>
+        <w:t xml:space="preserve"> </w:t>
+      </w:r>
+      <w:hyperlink r:id="rId21">
+        <w:r>
+          <w:rPr>
+            <w:rStyle w:val="Hyperlink"/>
+          </w:rPr>
+          <w:t xml:space="preserve">https://profullstack.com</w:t>
+        </w:r>
+      </w:hyperlink>
+    </w:p>
+    <w:p>
+      <w:pPr>
+        <w:pStyle w:val="Compact"/>
+        <w:numPr>
+          <w:ilvl w:val="0"/>
+          <w:numId w:val="1001"/>
+        </w:numPr>
+      </w:pPr>
+      <w:r>
+        <w:rPr>
+          <w:b/>
+          <w:bCs/>
+        </w:rPr>
+        <w:t xml:space="preserve">GitHub</w:t>
+      </w:r>
+      <w:r>
+        <w:t xml:space="preserve">:</w:t>
+      </w:r>
+      <w:r>
+        <w:t xml:space="preserve"> </w:t>
+      </w:r>
+      <w:hyperlink r:id="rId22">
+        <w:r>
+          <w:rPr>
+            <w:rStyle w:val="Hyperlink"/>
+          </w:rPr>
+          <w:t xml:space="preserve">profullstack</w:t>
+        </w:r>
+      </w:hyperlink>
+    </w:p>
+    <w:p>
+      <w:pPr>
+        <w:pStyle w:val="Compact"/>
+        <w:numPr>
+          <w:ilvl w:val="0"/>
+          <w:numId w:val="1001"/>
+        </w:numPr>
+      </w:pPr>
+      <w:r>
+        <w:rPr>
+          <w:b/>
+          <w:bCs/>
+        </w:rPr>
+        <w:t xml:space="preserve">Location</w:t>
+      </w:r>
+      <w:r>
+        <w:t xml:space="preserve">: Los Gatos, CA</w:t>
+      </w:r>
+    </w:p>
+    <w:bookmarkEnd w:id="23"/>
+    <w:bookmarkStart w:id="24" w:name="professional-summary"/>
+    <w:p>
+      <w:pPr>
+        <w:pStyle w:val="Heading2"/>
+      </w:pPr>
+      <w:r>
+        <w:t xml:space="preserve">Professional Summary</w:t>
+      </w:r>
+    </w:p>
+    <w:p>
+      <w:pPr>
         <w:pStyle w:val="FirstParagraph"/>
       </w:pPr>
       <w:r>
-        <w:t xml:space="preserve">I’m building a few</w:t>
-      </w:r>
-      <w:r>
-        <w:t xml:space="preserve"> </w:t>
-      </w:r>
-      <w:r>
-        <w:t xml:space="preserve">Projects that are ready for users</w:t>
-      </w:r>
-    </w:p>
-    <w:p>
-      <w:pPr>
-        <w:pStyle w:val="BodyText"/>
-      </w:pPr>
-      <w:r>
-        <w:t xml:space="preserve">https://bittorrented.com a torrent-first</w:t>
-      </w:r>
-      <w:r>
-        <w:t xml:space="preserve"> </w:t>
-      </w:r>
-      <w:r>
-        <w:t xml:space="preserve">Streaming platform</w:t>
-      </w:r>
-    </w:p>
-    <w:p>
-      <w:pPr>
-        <w:pStyle w:val="BodyText"/>
-      </w:pPr>
-      <w:r>
-        <w:t xml:space="preserve">http://marksyncr.com a free bookmarks synchronizer web extension for chrome safari and Firefox based browsers</w:t>
-      </w:r>
-    </w:p>
-    <w:p>
-      <w:pPr>
-        <w:pStyle w:val="BodyText"/>
-      </w:pPr>
-      <w:r>
-        <w:t xml:space="preserve">http://defpromo.com a zero-cloud self promotion web extension for all browsers helps automate commenting on social media posts to promote your product api keys required</w:t>
-      </w:r>
-    </w:p>
-    <w:p>
-      <w:pPr>
-        <w:pStyle w:val="BodyText"/>
-      </w:pPr>
-      <w:r>
-        <w:t xml:space="preserve">https://giv1.com Publish Newsletters &amp; Podcasts. The complete platform for content creators. Publish beautiful newsletters and podcasts</w:t>
-      </w:r>
-    </w:p>
-    <w:p>
-      <w:pPr>
-        <w:pStyle w:val="BodyText"/>
-      </w:pPr>
-      <w:r>
-        <w:t xml:space="preserve">https://tutorlinkup.com The Premier Cryto-friendly Marketplace for Test Taking Services, Tutoring and Homework Help</w:t>
-      </w:r>
-    </w:p>
-    <w:p>
-      <w:pPr>
-        <w:pStyle w:val="BodyText"/>
-      </w:pPr>
-      <w:r>
-        <w:t xml:space="preserve">https://www.parklookup.com Explore thousands of national, state, county, and city parks across America. Plan your next adventure today.</w:t>
-      </w:r>
-    </w:p>
-    <w:p>
-      <w:pPr>
-        <w:pStyle w:val="BodyText"/>
-      </w:pPr>
-      <w:r>
-        <w:t xml:space="preserve">http://summaryforge.com Turn long readings into ready-to-study notes and quizzes. Perfect for students cramming before exams.</w:t>
-      </w:r>
-    </w:p>
-    <w:p>
-      <w:pPr>
-        <w:pStyle w:val="BodyText"/>
-      </w:pPr>
-      <w:r>
-        <w:t xml:space="preserve">http://coinpayportal.com a non custodial crypto payment gateway Easy to integrate similar to stripe with web hooks and manage multiple businesses</w:t>
-      </w:r>
-    </w:p>
-    <w:p>
-      <w:pPr>
-        <w:pStyle w:val="BodyText"/>
-      </w:pPr>
-      <w:r>
-        <w:t xml:space="preserve">http://qrypt.chat a free quantum resistant chat application</w:t>
-      </w:r>
-    </w:p>
-    <w:p>
-      <w:pPr>
-        <w:pStyle w:val="BodyText"/>
-      </w:pPr>
-      <w:r>
-        <w:t xml:space="preserve">http://disrupthire.com ai assisted engineer consulting services</w:t>
-      </w:r>
-    </w:p>
-    <w:p>
-      <w:pPr>
-        <w:pStyle w:val="BodyText"/>
-      </w:pPr>
-      <w:r>
-        <w:t xml:space="preserve">http://saasrow.com link directory for saas and ai</w:t>
-      </w:r>
-    </w:p>
-    <w:p>
-      <w:pPr>
-        <w:pStyle w:val="BodyText"/>
-      </w:pPr>
-      <w:r>
-        <w:t xml:space="preserve">http://ugig.net Connect with skilled engineers and workers who leverage AI tools to deliver exceptional results. Free to browse, free to apply.</w:t>
-      </w:r>
-    </w:p>
-    <w:p>
-      <w:pPr>
-        <w:pStyle w:val="BodyText"/>
-      </w:pPr>
-      <w:r>
-        <w:t xml:space="preserve">http://cryptoshot.space an ethereum jackpot game just connect your wallet and take a shot at the jackpot contract is open source</w:t>
-      </w:r>
-    </w:p>
-    <w:p>
-      <w:pPr>
-        <w:pStyle w:val="BodyText"/>
-      </w:pPr>
-      <w:r>
-        <w:t xml:space="preserve">https://postammo.com a viral content idea generator for social media posters. Includes native mobile, PWA and web extension apps.</w:t>
-      </w:r>
-    </w:p>
-    <w:p>
-      <w:pPr>
-        <w:pStyle w:val="BodyText"/>
-      </w:pPr>
-      <w:r>
-        <w:t xml:space="preserve">http://icemap.app an anonymous, real-time incident reporting platform that helps communities stay informed about what’s happening around them.</w:t>
-      </w:r>
-    </w:p>
-    <w:p>
-      <w:pPr>
-        <w:pStyle w:val="BodyText"/>
-      </w:pPr>
-      <w:r>
-        <w:t xml:space="preserve">http://pairux.com - (coming soon) Collaborative screen sharing with simultaneous remote mouse and keyboard control. Like Screenhero, but open source.</w:t>
-      </w:r>
-    </w:p>
-    <w:p>
-      <w:pPr>
-        <w:pStyle w:val="BodyText"/>
-      </w:pPr>
-      <w:r>
-        <w:t xml:space="preserve">If you want to try out an app and provide feedback you can always email support@&lt;domain.name&gt; or join our discord at: https://discord.gg/U7dEXfBA3s</w:t>
-      </w:r>
-    </w:p>
-    <w:p>
-      <w:r>
-        <w:pict>
-          <v:rect style="width:0;height:1.5pt" o:hralign="center" o:hrstd="t" o:hr="t"/>
-        </w:pict>
+        <w:t xml:space="preserve">I'm building a number of projects that are ready for users today. A quick tour below — happy to demo any of them or build something similar for you.</w:t>
+      </w:r>
+    </w:p>
+    <w:bookmarkEnd w:id="24"/>
+    <w:bookmarkStart w:id="41" w:name="shipping-projects"/>
+    <w:p>
+      <w:pPr>
+        <w:pStyle w:val="Heading2"/>
+      </w:pPr>
+      <w:r>
+        <w:t xml:space="preserve">Shipping Projects</w:t>
+      </w:r>
+    </w:p>
+    <w:p>
+      <w:pPr>
+        <w:pStyle w:val="Compact"/>
+        <w:numPr>
+          <w:ilvl w:val="0"/>
+          <w:numId w:val="1002"/>
+        </w:numPr>
+      </w:pPr>
+      <w:r>
+        <w:rPr>
+          <w:b/>
+          <w:bCs/>
+        </w:rPr>
+        <w:t xml:space="preserve">Bittorrented</w:t>
+      </w:r>
+      <w:r>
+        <w:t xml:space="preserve"> </w:t>
+      </w:r>
+      <w:r>
+        <w:t xml:space="preserve">—</w:t>
+      </w:r>
+      <w:r>
+        <w:t xml:space="preserve"> </w:t>
+      </w:r>
+      <w:hyperlink r:id="rId25">
+        <w:r>
+          <w:rPr>
+            <w:rStyle w:val="Hyperlink"/>
+          </w:rPr>
+          <w:t xml:space="preserve">https://bittorrented.com</w:t>
+        </w:r>
+      </w:hyperlink>
+      <w:r>
+        <w:t xml:space="preserve"> </w:t>
+      </w:r>
+      <w:r>
+        <w:t xml:space="preserve">· torrent-first streaming platform.</w:t>
+      </w:r>
+    </w:p>
+    <w:p>
+      <w:pPr>
+        <w:pStyle w:val="Compact"/>
+        <w:numPr>
+          <w:ilvl w:val="0"/>
+          <w:numId w:val="1002"/>
+        </w:numPr>
+      </w:pPr>
+      <w:r>
+        <w:rPr>
+          <w:b/>
+          <w:bCs/>
+        </w:rPr>
+        <w:t xml:space="preserve">MarkSyncr</w:t>
+      </w:r>
+      <w:r>
+        <w:t xml:space="preserve"> </w:t>
+      </w:r>
+      <w:r>
+        <w:t xml:space="preserve">—</w:t>
+      </w:r>
+      <w:r>
+        <w:t xml:space="preserve"> </w:t>
+      </w:r>
+      <w:hyperlink r:id="rId26">
+        <w:r>
+          <w:rPr>
+            <w:rStyle w:val="Hyperlink"/>
+          </w:rPr>
+          <w:t xml:space="preserve">http://marksyncr.com</w:t>
+        </w:r>
+      </w:hyperlink>
+      <w:r>
+        <w:t xml:space="preserve"> </w:t>
+      </w:r>
+      <w:r>
+        <w:t xml:space="preserve">· free bookmarks synchronizer web extension for Chrome, Safari, and Firefox-based browsers.</w:t>
+      </w:r>
+    </w:p>
+    <w:p>
+      <w:pPr>
+        <w:pStyle w:val="Compact"/>
+        <w:numPr>
+          <w:ilvl w:val="0"/>
+          <w:numId w:val="1002"/>
+        </w:numPr>
+      </w:pPr>
+      <w:r>
+        <w:rPr>
+          <w:b/>
+          <w:bCs/>
+        </w:rPr>
+        <w:t xml:space="preserve">DefPromo</w:t>
+      </w:r>
+      <w:r>
+        <w:t xml:space="preserve"> </w:t>
+      </w:r>
+      <w:r>
+        <w:t xml:space="preserve">—</w:t>
+      </w:r>
+      <w:r>
+        <w:t xml:space="preserve"> </w:t>
+      </w:r>
+      <w:hyperlink r:id="rId27">
+        <w:r>
+          <w:rPr>
+            <w:rStyle w:val="Hyperlink"/>
+          </w:rPr>
+          <w:t xml:space="preserve">http://defpromo.com</w:t>
+        </w:r>
+      </w:hyperlink>
+      <w:r>
+        <w:t xml:space="preserve"> </w:t>
+      </w:r>
+      <w:r>
+        <w:t xml:space="preserve">· zero-cloud self-promotion browser extension; automates commenting on social posts to promote your product (bring your own API keys).</w:t>
+      </w:r>
+    </w:p>
+    <w:p>
+      <w:pPr>
+        <w:pStyle w:val="Compact"/>
+        <w:numPr>
+          <w:ilvl w:val="0"/>
+          <w:numId w:val="1002"/>
+        </w:numPr>
+      </w:pPr>
+      <w:r>
+        <w:rPr>
+          <w:b/>
+          <w:bCs/>
+        </w:rPr>
+        <w:t xml:space="preserve">Giv1</w:t>
+      </w:r>
+      <w:r>
+        <w:t xml:space="preserve"> </w:t>
+      </w:r>
+      <w:r>
+        <w:t xml:space="preserve">—</w:t>
+      </w:r>
+      <w:r>
+        <w:t xml:space="preserve"> </w:t>
+      </w:r>
+      <w:hyperlink r:id="rId28">
+        <w:r>
+          <w:rPr>
+            <w:rStyle w:val="Hyperlink"/>
+          </w:rPr>
+          <w:t xml:space="preserve">https://giv1.com</w:t>
+        </w:r>
+      </w:hyperlink>
+      <w:r>
+        <w:t xml:space="preserve"> </w:t>
+      </w:r>
+      <w:r>
+        <w:t xml:space="preserve">· complete platform for content creators to publish beautiful newsletters and podcasts.</w:t>
+      </w:r>
+    </w:p>
+    <w:p>
+      <w:pPr>
+        <w:pStyle w:val="Compact"/>
+        <w:numPr>
+          <w:ilvl w:val="0"/>
+          <w:numId w:val="1002"/>
+        </w:numPr>
+      </w:pPr>
+      <w:r>
+        <w:rPr>
+          <w:b/>
+          <w:bCs/>
+        </w:rPr>
+        <w:t xml:space="preserve">TutorLinkUp</w:t>
+      </w:r>
+      <w:r>
+        <w:t xml:space="preserve"> </w:t>
+      </w:r>
+      <w:r>
+        <w:t xml:space="preserve">—</w:t>
+      </w:r>
+      <w:r>
+        <w:t xml:space="preserve"> </w:t>
+      </w:r>
+      <w:hyperlink r:id="rId29">
+        <w:r>
+          <w:rPr>
+            <w:rStyle w:val="Hyperlink"/>
+          </w:rPr>
+          <w:t xml:space="preserve">https://tutorlinkup.com</w:t>
+        </w:r>
+      </w:hyperlink>
+      <w:r>
+        <w:t xml:space="preserve"> </w:t>
+      </w:r>
+      <w:r>
+        <w:t xml:space="preserve">· premier crypto-friendly marketplace for test-taking services, tutoring, and homework help.</w:t>
+      </w:r>
+    </w:p>
+    <w:p>
+      <w:pPr>
+        <w:pStyle w:val="Compact"/>
+        <w:numPr>
+          <w:ilvl w:val="0"/>
+          <w:numId w:val="1002"/>
+        </w:numPr>
+      </w:pPr>
+      <w:r>
+        <w:rPr>
+          <w:b/>
+          <w:bCs/>
+        </w:rPr>
+        <w:t xml:space="preserve">ParkLookup</w:t>
+      </w:r>
+      <w:r>
+        <w:t xml:space="preserve"> </w:t>
+      </w:r>
+      <w:r>
+        <w:t xml:space="preserve">—</w:t>
+      </w:r>
+      <w:r>
+        <w:t xml:space="preserve"> </w:t>
+      </w:r>
+      <w:hyperlink r:id="rId30">
+        <w:r>
+          <w:rPr>
+            <w:rStyle w:val="Hyperlink"/>
+          </w:rPr>
+          <w:t xml:space="preserve">https://www.parklookup.com</w:t>
+        </w:r>
+      </w:hyperlink>
+      <w:r>
+        <w:t xml:space="preserve"> </w:t>
+      </w:r>
+      <w:r>
+        <w:t xml:space="preserve">· explore thousands of national, state, county, and city parks across America.</w:t>
+      </w:r>
+    </w:p>
+    <w:p>
+      <w:pPr>
+        <w:pStyle w:val="Compact"/>
+        <w:numPr>
+          <w:ilvl w:val="0"/>
+          <w:numId w:val="1002"/>
+        </w:numPr>
+      </w:pPr>
+      <w:r>
+        <w:rPr>
+          <w:b/>
+          <w:bCs/>
+        </w:rPr>
+        <w:t xml:space="preserve">SummaryForge</w:t>
+      </w:r>
+      <w:r>
+        <w:t xml:space="preserve"> </w:t>
+      </w:r>
+      <w:r>
+        <w:t xml:space="preserve">—</w:t>
+      </w:r>
+      <w:r>
+        <w:t xml:space="preserve"> </w:t>
+      </w:r>
+      <w:hyperlink r:id="rId31">
+        <w:r>
+          <w:rPr>
+            <w:rStyle w:val="Hyperlink"/>
+          </w:rPr>
+          <w:t xml:space="preserve">http://summaryforge.com</w:t>
+        </w:r>
+      </w:hyperlink>
+      <w:r>
+        <w:t xml:space="preserve"> </w:t>
+      </w:r>
+      <w:r>
+        <w:t xml:space="preserve">· turn long readings into ready-to-study notes and quizzes. Perfect for students cramming before exams.</w:t>
+      </w:r>
+    </w:p>
+    <w:p>
+      <w:pPr>
+        <w:pStyle w:val="Compact"/>
+        <w:numPr>
+          <w:ilvl w:val="0"/>
+          <w:numId w:val="1002"/>
+        </w:numPr>
+      </w:pPr>
+      <w:r>
+        <w:rPr>
+          <w:b/>
+          <w:bCs/>
+        </w:rPr>
+        <w:t xml:space="preserve">CoinPayPortal</w:t>
+      </w:r>
+      <w:r>
+        <w:t xml:space="preserve"> </w:t>
+      </w:r>
+      <w:r>
+        <w:t xml:space="preserve">—</w:t>
+      </w:r>
+      <w:r>
+        <w:t xml:space="preserve"> </w:t>
+      </w:r>
+      <w:hyperlink r:id="rId32">
+        <w:r>
+          <w:rPr>
+            <w:rStyle w:val="Hyperlink"/>
+          </w:rPr>
+          <w:t xml:space="preserve">http://coinpayportal.com</w:t>
+        </w:r>
+      </w:hyperlink>
+      <w:r>
+        <w:t xml:space="preserve"> </w:t>
+      </w:r>
+      <w:r>
+        <w:t xml:space="preserve">· non-custodial crypto payment gateway; Stripe-like integration with webhooks and multi-business support.</w:t>
+      </w:r>
+    </w:p>
+    <w:p>
+      <w:pPr>
+        <w:pStyle w:val="Compact"/>
+        <w:numPr>
+          <w:ilvl w:val="0"/>
+          <w:numId w:val="1002"/>
+        </w:numPr>
+      </w:pPr>
+      <w:r>
+        <w:rPr>
+          <w:b/>
+          <w:bCs/>
+        </w:rPr>
+        <w:t xml:space="preserve">qrypt.chat</w:t>
+      </w:r>
+      <w:r>
+        <w:t xml:space="preserve"> </w:t>
+      </w:r>
+      <w:r>
+        <w:t xml:space="preserve">—</w:t>
+      </w:r>
+      <w:r>
+        <w:t xml:space="preserve"> </w:t>
+      </w:r>
+      <w:hyperlink r:id="rId33">
+        <w:r>
+          <w:rPr>
+            <w:rStyle w:val="Hyperlink"/>
+          </w:rPr>
+          <w:t xml:space="preserve">http://qrypt.chat</w:t>
+        </w:r>
+      </w:hyperlink>
+      <w:r>
+        <w:t xml:space="preserve"> </w:t>
+      </w:r>
+      <w:r>
+        <w:t xml:space="preserve">· free quantum-resistant chat application.</w:t>
+      </w:r>
+    </w:p>
+    <w:p>
+      <w:pPr>
+        <w:pStyle w:val="Compact"/>
+        <w:numPr>
+          <w:ilvl w:val="0"/>
+          <w:numId w:val="1002"/>
+        </w:numPr>
+      </w:pPr>
+      <w:r>
+        <w:rPr>
+          <w:b/>
+          <w:bCs/>
+        </w:rPr>
+        <w:t xml:space="preserve">DisruptHire</w:t>
+      </w:r>
+      <w:r>
+        <w:t xml:space="preserve"> </w:t>
+      </w:r>
+      <w:r>
+        <w:t xml:space="preserve">—</w:t>
+      </w:r>
+      <w:r>
+        <w:t xml:space="preserve"> </w:t>
+      </w:r>
+      <w:hyperlink r:id="rId34">
+        <w:r>
+          <w:rPr>
+            <w:rStyle w:val="Hyperlink"/>
+          </w:rPr>
+          <w:t xml:space="preserve">http://disrupthire.com</w:t>
+        </w:r>
+      </w:hyperlink>
+      <w:r>
+        <w:t xml:space="preserve"> </w:t>
+      </w:r>
+      <w:r>
+        <w:t xml:space="preserve">· AI-assisted engineer consulting services.</w:t>
+      </w:r>
+    </w:p>
+    <w:p>
+      <w:pPr>
+        <w:pStyle w:val="Compact"/>
+        <w:numPr>
+          <w:ilvl w:val="0"/>
+          <w:numId w:val="1002"/>
+        </w:numPr>
+      </w:pPr>
+      <w:r>
+        <w:rPr>
+          <w:b/>
+          <w:bCs/>
+        </w:rPr>
+        <w:t xml:space="preserve">SaaSRow</w:t>
+      </w:r>
+      <w:r>
+        <w:t xml:space="preserve"> </w:t>
+      </w:r>
+      <w:r>
+        <w:t xml:space="preserve">—</w:t>
+      </w:r>
+      <w:r>
+        <w:t xml:space="preserve"> </w:t>
+      </w:r>
+      <w:hyperlink r:id="rId35">
+        <w:r>
+          <w:rPr>
+            <w:rStyle w:val="Hyperlink"/>
+          </w:rPr>
+          <w:t xml:space="preserve">http://saasrow.com</w:t>
+        </w:r>
+      </w:hyperlink>
+      <w:r>
+        <w:t xml:space="preserve"> </w:t>
+      </w:r>
+      <w:r>
+        <w:t xml:space="preserve">· link directory for SaaS and AI.</w:t>
+      </w:r>
+    </w:p>
+    <w:p>
+      <w:pPr>
+        <w:pStyle w:val="Compact"/>
+        <w:numPr>
+          <w:ilvl w:val="0"/>
+          <w:numId w:val="1002"/>
+        </w:numPr>
+      </w:pPr>
+      <w:r>
+        <w:rPr>
+          <w:b/>
+          <w:bCs/>
+        </w:rPr>
+        <w:t xml:space="preserve">UGig</w:t>
+      </w:r>
+      <w:r>
+        <w:t xml:space="preserve"> </w:t>
+      </w:r>
+      <w:r>
+        <w:t xml:space="preserve">—</w:t>
+      </w:r>
+      <w:r>
+        <w:t xml:space="preserve"> </w:t>
+      </w:r>
+      <w:hyperlink r:id="rId36">
+        <w:r>
+          <w:rPr>
+            <w:rStyle w:val="Hyperlink"/>
+          </w:rPr>
+          <w:t xml:space="preserve">http://ugig.net</w:t>
+        </w:r>
+      </w:hyperlink>
+      <w:r>
+        <w:t xml:space="preserve"> </w:t>
+      </w:r>
+      <w:r>
+        <w:t xml:space="preserve">· connect with skilled engineers and workers who leverage AI tools. Free to browse, free to apply.</w:t>
+      </w:r>
+    </w:p>
+    <w:p>
+      <w:pPr>
+        <w:pStyle w:val="Compact"/>
+        <w:numPr>
+          <w:ilvl w:val="0"/>
+          <w:numId w:val="1002"/>
+        </w:numPr>
+      </w:pPr>
+      <w:r>
+        <w:rPr>
+          <w:b/>
+          <w:bCs/>
+        </w:rPr>
+        <w:t xml:space="preserve">CryptoShot</w:t>
+      </w:r>
+      <w:r>
+        <w:t xml:space="preserve"> </w:t>
+      </w:r>
+      <w:r>
+        <w:t xml:space="preserve">—</w:t>
+      </w:r>
+      <w:r>
+        <w:t xml:space="preserve"> </w:t>
+      </w:r>
+      <w:hyperlink r:id="rId37">
+        <w:r>
+          <w:rPr>
+            <w:rStyle w:val="Hyperlink"/>
+          </w:rPr>
+          <w:t xml:space="preserve">http://cryptoshot.space</w:t>
+        </w:r>
+      </w:hyperlink>
+      <w:r>
+        <w:t xml:space="preserve"> </w:t>
+      </w:r>
+      <w:r>
+        <w:t xml:space="preserve">· Ethereum jackpot game; connect your wallet and take a shot. Open-source contract.</w:t>
+      </w:r>
+    </w:p>
+    <w:p>
+      <w:pPr>
+        <w:pStyle w:val="Compact"/>
+        <w:numPr>
+          <w:ilvl w:val="0"/>
+          <w:numId w:val="1002"/>
+        </w:numPr>
+      </w:pPr>
+      <w:r>
+        <w:rPr>
+          <w:b/>
+          <w:bCs/>
+        </w:rPr>
+        <w:t xml:space="preserve">PostAmmo</w:t>
+      </w:r>
+      <w:r>
+        <w:t xml:space="preserve"> </w:t>
+      </w:r>
+      <w:r>
+        <w:t xml:space="preserve">—</w:t>
+      </w:r>
+      <w:r>
+        <w:t xml:space="preserve"> </w:t>
+      </w:r>
+      <w:hyperlink r:id="rId38">
+        <w:r>
+          <w:rPr>
+            <w:rStyle w:val="Hyperlink"/>
+          </w:rPr>
+          <w:t xml:space="preserve">https://postammo.com</w:t>
+        </w:r>
+      </w:hyperlink>
+      <w:r>
+        <w:t xml:space="preserve"> </w:t>
+      </w:r>
+      <w:r>
+        <w:t xml:space="preserve">· viral content idea generator for social media posters. Native mobile, PWA, and web-extension apps.</w:t>
+      </w:r>
+    </w:p>
+    <w:p>
+      <w:pPr>
+        <w:pStyle w:val="Compact"/>
+        <w:numPr>
+          <w:ilvl w:val="0"/>
+          <w:numId w:val="1002"/>
+        </w:numPr>
+      </w:pPr>
+      <w:r>
+        <w:rPr>
+          <w:b/>
+          <w:bCs/>
+        </w:rPr>
+        <w:t xml:space="preserve">IceMap</w:t>
+      </w:r>
+      <w:r>
+        <w:t xml:space="preserve"> </w:t>
+      </w:r>
+      <w:r>
+        <w:t xml:space="preserve">—</w:t>
+      </w:r>
+      <w:r>
+        <w:t xml:space="preserve"> </w:t>
+      </w:r>
+      <w:hyperlink r:id="rId39">
+        <w:r>
+          <w:rPr>
+            <w:rStyle w:val="Hyperlink"/>
+          </w:rPr>
+          <w:t xml:space="preserve">http://icemap.app</w:t>
+        </w:r>
+      </w:hyperlink>
+      <w:r>
+        <w:t xml:space="preserve"> </w:t>
+      </w:r>
+      <w:r>
+        <w:t xml:space="preserve">· anonymous, real-time incident reporting so communities stay informed about what's happening around them.</w:t>
+      </w:r>
+    </w:p>
+    <w:p>
+      <w:pPr>
+        <w:pStyle w:val="Compact"/>
+        <w:numPr>
+          <w:ilvl w:val="0"/>
+          <w:numId w:val="1002"/>
+        </w:numPr>
+      </w:pPr>
+      <w:r>
+        <w:rPr>
+          <w:b/>
+          <w:bCs/>
+        </w:rPr>
+        <w:t xml:space="preserve">PairUX</w:t>
+      </w:r>
+      <w:r>
+        <w:t xml:space="preserve"> </w:t>
+      </w:r>
+      <w:r>
+        <w:t xml:space="preserve">—</w:t>
+      </w:r>
+      <w:r>
+        <w:t xml:space="preserve"> </w:t>
+      </w:r>
+      <w:hyperlink r:id="rId40">
+        <w:r>
+          <w:rPr>
+            <w:rStyle w:val="Hyperlink"/>
+          </w:rPr>
+          <w:t xml:space="preserve">http://pairux.com</w:t>
+        </w:r>
+      </w:hyperlink>
+      <w:r>
+        <w:t xml:space="preserve"> </w:t>
+      </w:r>
+      <w:r>
+        <w:t xml:space="preserve">· (coming soon) collaborative screen sharing with simultaneous remote mouse and keyboard control. Like Screenhero, but open source.</w:t>
+      </w:r>
+    </w:p>
+    <w:bookmarkEnd w:id="41"/>
+    <w:bookmarkStart w:id="43" w:name="get-in-touch"/>
+    <w:p>
+      <w:pPr>
+        <w:pStyle w:val="Heading2"/>
+      </w:pPr>
+      <w:r>
+        <w:t xml:space="preserve">Get in Touch</w:t>
       </w:r>
     </w:p>
     <w:p>
@@ -170,39 +835,115 @@
         <w:pStyle w:val="FirstParagraph"/>
       </w:pPr>
       <w:r>
-        <w:t xml:space="preserve">☎️ Hire me: Anthony</w:t>
-      </w:r>
-      <w:r>
-        <w:t xml:space="preserve"> </w:t>
-      </w:r>
-      <w:r>
-        <w:t xml:space="preserve">“</w:t>
-      </w:r>
-      <w:r>
-        <w:t xml:space="preserve">Chovy</w:t>
-      </w:r>
-      <w:r>
-        <w:t xml:space="preserve">”</w:t>
-      </w:r>
-      <w:r>
-        <w:t xml:space="preserve"> </w:t>
-      </w:r>
-      <w:r>
-        <w:t xml:space="preserve">at +1 (408) 656-2473.</w:t>
-      </w:r>
-      <w:r>
-        <w:t xml:space="preserve"> </w:t>
-      </w:r>
-      <w:r>
-        <w:t xml:space="preserve">I’ll build you something similar for $2500 USD in a week.</w:t>
-      </w:r>
-      <w:r>
-        <w:t xml:space="preserve"> </w:t>
-      </w:r>
-      <w:r>
-        <w:t xml:space="preserve">https://github.com/profullstack</w:t>
-      </w:r>
-    </w:p>
+        <w:t xml:space="preserve">Want to try one out and give feedback? Email support@&lt;domain.name&gt; or join the Discord at</w:t>
+      </w:r>
+      <w:r>
+        <w:t xml:space="preserve"> </w:t>
+      </w:r>
+      <w:hyperlink r:id="rId42">
+        <w:r>
+          <w:rPr>
+            <w:rStyle w:val="Hyperlink"/>
+          </w:rPr>
+          <w:t xml:space="preserve">https://discord.gg/U7dEXfBA3s</w:t>
+        </w:r>
+      </w:hyperlink>
+      <w:r>
+        <w:t xml:space="preserve">.</w:t>
+      </w:r>
+    </w:p>
+    <w:bookmarkEnd w:id="43"/>
+    <w:bookmarkStart w:id="44" w:name="hire-me"/>
+    <w:p>
+      <w:pPr>
+        <w:pStyle w:val="Heading2"/>
+      </w:pPr>
+      <w:r>
+        <w:t xml:space="preserve">Hire Me</w:t>
+      </w:r>
+    </w:p>
+    <w:p>
+      <w:pPr>
+        <w:pStyle w:val="FirstParagraph"/>
+      </w:pPr>
+      <w:r>
+        <w:t xml:space="preserve">☎️ Hire me — Anthony "Chovy" — at</w:t>
+      </w:r>
+      <w:r>
+        <w:t xml:space="preserve"> </w:t>
+      </w:r>
+      <w:r>
+        <w:rPr>
+          <w:b/>
+          <w:bCs/>
+        </w:rPr>
+        <w:t xml:space="preserve">+1 (408) 656-2473</w:t>
+      </w:r>
+      <w:r>
+        <w:t xml:space="preserve">. I'll build you something similar for</w:t>
+      </w:r>
+      <w:r>
+        <w:t xml:space="preserve"> </w:t>
+      </w:r>
+      <w:r>
+        <w:rPr>
+          <w:b/>
+          <w:bCs/>
+        </w:rPr>
+        <w:t xml:space="preserve">$2,500 USD in a week</w:t>
+      </w:r>
+      <w:r>
+        <w:t xml:space="preserve">.</w:t>
+      </w:r>
+    </w:p>
+    <w:p>
+      <w:pPr>
+        <w:pStyle w:val="Compact"/>
+        <w:numPr>
+          <w:ilvl w:val="0"/>
+          <w:numId w:val="1003"/>
+        </w:numPr>
+      </w:pPr>
+      <w:r>
+        <w:t xml:space="preserve">GitHub:</w:t>
+      </w:r>
+      <w:r>
+        <w:t xml:space="preserve"> </w:t>
+      </w:r>
+      <w:hyperlink r:id="rId22">
+        <w:r>
+          <w:rPr>
+            <w:rStyle w:val="Hyperlink"/>
+          </w:rPr>
+          <w:t xml:space="preserve">github.com/profullstack</w:t>
+        </w:r>
+      </w:hyperlink>
+    </w:p>
+    <w:p>
+      <w:pPr>
+        <w:pStyle w:val="Compact"/>
+        <w:numPr>
+          <w:ilvl w:val="0"/>
+          <w:numId w:val="1003"/>
+        </w:numPr>
+      </w:pPr>
+      <w:r>
+        <w:t xml:space="preserve">Web:</w:t>
+      </w:r>
+      <w:r>
+        <w:t xml:space="preserve"> </w:t>
+      </w:r>
+      <w:hyperlink r:id="rId21">
+        <w:r>
+          <w:rPr>
+            <w:rStyle w:val="Hyperlink"/>
+          </w:rPr>
+          <w:t xml:space="preserve">https://profullstack.com</w:t>
+        </w:r>
+      </w:hyperlink>
+    </w:p>
+    <w:bookmarkEnd w:id="44"/>
+    <w:bookmarkEnd w:id="45"/>
     <w:sectPr/>
   </w:body>
 </w:document>
@@ -309,8 +1050,93 @@
       </w:pPr>
     </w:lvl>
   </w:abstractNum>
+  <w:abstractNum w:abstractNumId="991">
+    <w:nsid w:val="0000A991"/>
+    <w:multiLevelType w:val="multilevel"/>
+    <w:lvl w:ilvl="0">
+      <w:numFmt w:val="bullet"/>
+      <w:lvlText w:val="•"/>
+      <w:lvlJc w:val="left"/>
+      <w:pPr>
+        <w:ind w:left="720" w:hanging="480"/>
+      </w:pPr>
+    </w:lvl>
+    <w:lvl w:ilvl="1">
+      <w:numFmt w:val="bullet"/>
+      <w:lvlText w:val="–"/>
+      <w:lvlJc w:val="left"/>
+      <w:pPr>
+        <w:ind w:left="1440" w:hanging="480"/>
+      </w:pPr>
+    </w:lvl>
+    <w:lvl w:ilvl="2">
+      <w:numFmt w:val="bullet"/>
+      <w:lvlText w:val="•"/>
+      <w:lvlJc w:val="left"/>
+      <w:pPr>
+        <w:ind w:left="2160" w:hanging="480"/>
+      </w:pPr>
+    </w:lvl>
+    <w:lvl w:ilvl="3">
+      <w:numFmt w:val="bullet"/>
+      <w:lvlText w:val="–"/>
+      <w:lvlJc w:val="left"/>
+      <w:pPr>
+        <w:ind w:left="2880" w:hanging="480"/>
+      </w:pPr>
+    </w:lvl>
+    <w:lvl w:ilvl="4">
+      <w:numFmt w:val="bullet"/>
+      <w:lvlText w:val="•"/>
+      <w:lvlJc w:val="left"/>
+      <w:pPr>
+        <w:ind w:left="3600" w:hanging="480"/>
+      </w:pPr>
+    </w:lvl>
+    <w:lvl w:ilvl="5">
+      <w:numFmt w:val="bullet"/>
+      <w:lvlText w:val="–"/>
+      <w:lvlJc w:val="left"/>
+      <w:pPr>
+        <w:ind w:left="4320" w:hanging="480"/>
+      </w:pPr>
+    </w:lvl>
+    <w:lvl w:ilvl="6">
+      <w:numFmt w:val="bullet"/>
+      <w:lvlText w:val="•"/>
+      <w:lvlJc w:val="left"/>
+      <w:pPr>
+        <w:ind w:left="5040" w:hanging="480"/>
+      </w:pPr>
+    </w:lvl>
+    <w:lvl w:ilvl="7">
+      <w:numFmt w:val="bullet"/>
+      <w:lvlText w:val="–"/>
+      <w:lvlJc w:val="left"/>
+      <w:pPr>
+        <w:ind w:left="5760" w:hanging="480"/>
+      </w:pPr>
+    </w:lvl>
+    <w:lvl w:ilvl="8">
+      <w:numFmt w:val="bullet"/>
+      <w:lvlText w:val="•"/>
+      <w:lvlJc w:val="left"/>
+      <w:pPr>
+        <w:ind w:left="6480" w:hanging="480"/>
+      </w:pPr>
+    </w:lvl>
+  </w:abstractNum>
   <w:num w:numId="1000">
     <w:abstractNumId w:val="990"/>
+  </w:num>
+  <w:num w:numId="1001">
+    <w:abstractNumId w:val="991"/>
+  </w:num>
+  <w:num w:numId="1002">
+    <w:abstractNumId w:val="991"/>
+  </w:num>
+  <w:num w:numId="1003">
+    <w:abstractNumId w:val="991"/>
   </w:num>
 </w:numbering>
 </file>
@@ -323,7 +1149,7 @@
         <w:rFonts w:asciiTheme="minorHAnsi" w:cstheme="minorBidi" w:eastAsiaTheme="minorHAnsi" w:hAnsiTheme="minorHAnsi"/>
         <w:sz w:val="24"/>
         <w:szCs w:val="24"/>
-        <w:lang w:bidi="ar-SA" w:eastAsia="en-US" w:val="en-US"/>
+        <w:lang w:bidi="ar-SA" w:eastAsia="en-US" w:val="en"/>
       </w:rPr>
     </w:rPrDefault>
     <w:pPrDefault>

</xml_diff>